<commit_message>
Manuscript: state the training corpus and per-task partitions
The abstract and Methods jumped straight to DDI without ever saying what the
models were trained on, which understated the study and invited the obvious
reviewer question. Added to the abstract: the ~266k-image eight-source corpus
(~15k Fitzpatrick IV-VI), one-pass cached feature extraction, and the per-task
training sizes. Added Table 0 to Methods 3.1 with exact partitions:
25-condition 33,250 train / 5,886 external (3,813 deduped);
9-condition 197,137 train / 51,035 external (class-degenerate -> OOF CV);
DDI 656 image-level 5-fold CV. No result changed.
</commit_message>
<xml_diff>
--- a/reports/manuscript/MNKAI-III_Manuscript.docx
+++ b/reports/manuscript/MNKAI-III_Manuscript.docx
@@ -124,7 +124,7 @@
           <w:sz w:val="22"/>
           <w:szCs w:val="22"/>
         </w:rPr>
-        <w:t xml:space="preserve"> We built a complete decision-support pipeline on a single 6 GB consumer laptop, with no GPU training in the primary method. The backbone is frozen; only lightweight linear/shallow probes are trained on cached features. On the Diverse Dermatology Images (DDI) benchmark of 656 biopsy-confirmed clinical photographs (one lesion per image), we evaluate malignant-versus-benign classification with image-level 5-fold stratified cross-validation, the standard DDI protocol. We compare a single frozen DINOv2 ViT-B/14 probe against a score-averaged ensemble of six frozen foundation backbones (DINOv2-B, DINOv2-B-reg, DINOv2-L, EVA-02-B, ConvNeXt-V2-B, SigLIP-B). Statistical support is provided by stratified bootstrap 95% confidence intervals (CIs), paired-bootstrap Delta-AUROC tests, and multi-seed cross-validation. Separately, on a 25-condition Indian-focused classification task we compare the frozen probe against a matched fine-tuning baseline (classifier re-training, cRT) on a duplicate-audited external test set, and we ship a trust stack: temperature-scaled calibration, RAPS conformal prediction, and per-Fitzpatrick selective prediction. A photo-grounded, confidence-gated large-language-model (LLM) triage layer is described as an engineering contribution.</w:t>
+        <w:t xml:space="preserve"> We assembled approximately 266,000 labeled, de-duplicated images from eight public sources spanning dermoscopy (ISIC-2019, ISIC-2024, BCN20000) and clinical photography (Fitzpatrick17k/CleanPatrick, SCIN, DermaCon-IN, PAD-UFES-20, DDI, Mpox/MSLD), of which roughly 15,000 are Fitzpatrick IV–VI — the binding scarcity. Frozen-backbone features for the entire corpus were extracted once in a single forward pass and cached; every subsequent experiment is a lightweight head fit on those cached features, so the complete decision-support pipeline was built on a single 6 GB consumer laptop with no backbone gradient step in the primary method. The 25-condition Indian-focused task is trained on 33,250 group-aware (patient/lesion-disjoint) images and evaluated on a duplicate-audited external test set (5,886 images; 3,813 after near-duplicate removal); the 9-condition dermoscopy task is trained on 197,137 images and evaluated out-of-fold because its external partition is class-degenerate. On the Diverse Dermatology Images (DDI) benchmark of 656 biopsy-confirmed clinical photographs (one lesion per image), we evaluate malignant-versus-benign classification with image-level 5-fold stratified cross-validation, the standard DDI protocol. We compare a single frozen DINOv2 ViT-B/14 probe against a score-averaged ensemble of six frozen foundation backbones (DINOv2-B, DINOv2-B-reg, DINOv2-L, EVA-02-B, ConvNeXt-V2-B, SigLIP-B). Statistical support is provided by stratified bootstrap 95% confidence intervals (CIs), paired-bootstrap Delta-AUROC tests, and multi-seed cross-validation. Separately, on a 25-condition Indian-focused classification task we compare the frozen probe against a matched fine-tuning baseline (classifier re-training, cRT) on a duplicate-audited external test set, and we ship a trust stack: temperature-scaled calibration, RAPS conformal prediction, and per-Fitzpatrick selective prediction. A photo-grounded, confidence-gated large-language-model (LLM) triage layer is described as an engineering contribution.</w:t>
       </w:r>
     </w:p>
     <w:p>
@@ -772,6 +772,630 @@
         </w:rPr>
         <w:t xml:space="preserve">The training corpus comprises approximately 266,000 labeled, de-duplicated images spanning dermoscopy (ISIC-2019, ISIC-2024, BCN20000) and clinical photographs (Fitzpatrick17k cleaned via CleanPatrick, SCIN, DermaCon-IN, PAD-UFES-20, DDI, and Mpox/MSLD). Darker-skin (Fitzpatrick IV–VI) coverage is approximately 15,000 images — the binding scarcity. No synthetic data and no scraping beyond public research datasets were used. Splits are group-aware (patient/lesion-disjoint); Section 3.6 details a residual leakage correction.</w:t>
       </w:r>
+    </w:p>
+    <w:p>
+      <w:pPr>
+        <w:spacing w:after="140" w:before="60" w:line="300"/>
+        <w:jc w:val="both"/>
+      </w:pPr>
+      <w:r>
+        <w:rPr>
+          <w:rFonts w:ascii="Cambria" w:cs="Cambria" w:eastAsia="Cambria" w:hAnsi="Cambria"/>
+          <w:sz w:val="22"/>
+          <w:szCs w:val="22"/>
+        </w:rPr>
+        <w:t xml:space="preserve">From this corpus we derive two multiclass tasks. The </w:t>
+      </w:r>
+      <w:r>
+        <w:rPr>
+          <w:rFonts w:ascii="Cambria" w:cs="Cambria" w:eastAsia="Cambria" w:hAnsi="Cambria"/>
+          <w:b/>
+          <w:bCs/>
+          <w:sz w:val="22"/>
+          <w:szCs w:val="22"/>
+        </w:rPr>
+        <w:t xml:space="preserve">25-condition Indian-focused task</w:t>
+      </w:r>
+      <w:r>
+        <w:rPr>
+          <w:rFonts w:ascii="Cambria" w:cs="Cambria" w:eastAsia="Cambria" w:hAnsi="Cambria"/>
+          <w:sz w:val="22"/>
+          <w:szCs w:val="22"/>
+        </w:rPr>
+        <w:t xml:space="preserve"> comprises 39,136 images — 33,250 in the training/cross-validation partition and 5,886 in a held-out external test partition (reduced to 3,813 after the near-duplicate correction of Section 3.6). The </w:t>
+      </w:r>
+      <w:r>
+        <w:rPr>
+          <w:rFonts w:ascii="Cambria" w:cs="Cambria" w:eastAsia="Cambria" w:hAnsi="Cambria"/>
+          <w:b/>
+          <w:bCs/>
+          <w:sz w:val="22"/>
+          <w:szCs w:val="22"/>
+        </w:rPr>
+        <w:t xml:space="preserve">9-condition dermoscopy task</w:t>
+      </w:r>
+      <w:r>
+        <w:rPr>
+          <w:rFonts w:ascii="Cambria" w:cs="Cambria" w:eastAsia="Cambria" w:hAnsi="Cambria"/>
+          <w:sz w:val="22"/>
+          <w:szCs w:val="22"/>
+        </w:rPr>
+        <w:t xml:space="preserve"> comprises 248,172 images — 197,137 training/cross-validation and 51,035 external; because its external partition is 99.8% nevi (class-degenerate), we report out-of-fold cross-validation for that task instead. Backbone features for every image in both tasks were extracted once and cached (a single inference pass, no gradients), after which all probe fitting, calibration, conformal, and ablation experiments run on CPU from cache — this is what makes the full study laptop-feasible.</w:t>
+      </w:r>
+    </w:p>
+    <w:p>
+      <w:pPr>
+        <w:spacing w:after="140" w:before="60" w:line="300"/>
+        <w:jc w:val="both"/>
+      </w:pPr>
+      <w:r>
+        <w:rPr>
+          <w:rFonts w:ascii="Cambria" w:cs="Cambria" w:eastAsia="Cambria" w:hAnsi="Cambria"/>
+          <w:b/>
+          <w:bCs/>
+          <w:sz w:val="22"/>
+          <w:szCs w:val="22"/>
+        </w:rPr>
+        <w:t xml:space="preserve">Table 0. Task partitions.</w:t>
+      </w:r>
+    </w:p>
+    <w:tbl>
+      <w:tblPr>
+        <w:tblW w:type="dxa" w:w="9360"/>
+        <w:tblBorders>
+          <w:top w:val="single" w:color="C9D8DA" w:sz="4"/>
+          <w:left w:val="single" w:color="C9D8DA" w:sz="4"/>
+          <w:bottom w:val="single" w:color="C9D8DA" w:sz="4"/>
+          <w:right w:val="single" w:color="C9D8DA" w:sz="4"/>
+          <w:insideH w:val="single" w:color="C9D8DA" w:sz="2"/>
+          <w:insideV w:val="single" w:color="C9D8DA" w:sz="2"/>
+        </w:tblBorders>
+      </w:tblPr>
+      <w:tblGrid>
+        <w:gridCol w:w="1872"/>
+        <w:gridCol w:w="1872"/>
+        <w:gridCol w:w="1872"/>
+        <w:gridCol w:w="1872"/>
+        <w:gridCol w:w="1872"/>
+      </w:tblGrid>
+      <w:tr>
+        <w:trPr>
+          <w:tblHeader/>
+        </w:trPr>
+        <w:tc>
+          <w:tcPr>
+            <w:tcW w:type="dxa" w:w="1872"/>
+            <w:shd w:fill="EDF3F4" w:val="clear"/>
+            <w:tcMar>
+              <w:top w:type="dxa" w:w="60"/>
+              <w:left w:type="dxa" w:w="100"/>
+              <w:bottom w:type="dxa" w:w="60"/>
+              <w:right w:type="dxa" w:w="100"/>
+            </w:tcMar>
+          </w:tcPr>
+          <w:p>
+            <w:pPr>
+              <w:spacing w:after="20" w:before="20"/>
+            </w:pPr>
+            <w:r>
+              <w:rPr>
+                <w:rFonts w:ascii="Calibri" w:cs="Calibri" w:eastAsia="Calibri" w:hAnsi="Calibri"/>
+                <w:b/>
+                <w:bCs/>
+                <w:sz w:val="19"/>
+                <w:szCs w:val="19"/>
+              </w:rPr>
+              <w:t xml:space="preserve">Task</w:t>
+            </w:r>
+          </w:p>
+        </w:tc>
+        <w:tc>
+          <w:tcPr>
+            <w:tcW w:type="dxa" w:w="1872"/>
+            <w:shd w:fill="EDF3F4" w:val="clear"/>
+            <w:tcMar>
+              <w:top w:type="dxa" w:w="60"/>
+              <w:left w:type="dxa" w:w="100"/>
+              <w:bottom w:type="dxa" w:w="60"/>
+              <w:right w:type="dxa" w:w="100"/>
+            </w:tcMar>
+          </w:tcPr>
+          <w:p>
+            <w:pPr>
+              <w:spacing w:after="20" w:before="20"/>
+            </w:pPr>
+            <w:r>
+              <w:rPr>
+                <w:rFonts w:ascii="Calibri" w:cs="Calibri" w:eastAsia="Calibri" w:hAnsi="Calibri"/>
+                <w:b/>
+                <w:bCs/>
+                <w:sz w:val="19"/>
+                <w:szCs w:val="19"/>
+              </w:rPr>
+              <w:t xml:space="preserve">Classes</w:t>
+            </w:r>
+          </w:p>
+        </w:tc>
+        <w:tc>
+          <w:tcPr>
+            <w:tcW w:type="dxa" w:w="1872"/>
+            <w:shd w:fill="EDF3F4" w:val="clear"/>
+            <w:tcMar>
+              <w:top w:type="dxa" w:w="60"/>
+              <w:left w:type="dxa" w:w="100"/>
+              <w:bottom w:type="dxa" w:w="60"/>
+              <w:right w:type="dxa" w:w="100"/>
+            </w:tcMar>
+          </w:tcPr>
+          <w:p>
+            <w:pPr>
+              <w:spacing w:after="20" w:before="20"/>
+            </w:pPr>
+            <w:r>
+              <w:rPr>
+                <w:rFonts w:ascii="Calibri" w:cs="Calibri" w:eastAsia="Calibri" w:hAnsi="Calibri"/>
+                <w:b/>
+                <w:bCs/>
+                <w:sz w:val="19"/>
+                <w:szCs w:val="19"/>
+              </w:rPr>
+              <w:t xml:space="preserve">Train / CV</w:t>
+            </w:r>
+          </w:p>
+        </w:tc>
+        <w:tc>
+          <w:tcPr>
+            <w:tcW w:type="dxa" w:w="1872"/>
+            <w:shd w:fill="EDF3F4" w:val="clear"/>
+            <w:tcMar>
+              <w:top w:type="dxa" w:w="60"/>
+              <w:left w:type="dxa" w:w="100"/>
+              <w:bottom w:type="dxa" w:w="60"/>
+              <w:right w:type="dxa" w:w="100"/>
+            </w:tcMar>
+          </w:tcPr>
+          <w:p>
+            <w:pPr>
+              <w:spacing w:after="20" w:before="20"/>
+            </w:pPr>
+            <w:r>
+              <w:rPr>
+                <w:rFonts w:ascii="Calibri" w:cs="Calibri" w:eastAsia="Calibri" w:hAnsi="Calibri"/>
+                <w:b/>
+                <w:bCs/>
+                <w:sz w:val="19"/>
+                <w:szCs w:val="19"/>
+              </w:rPr>
+              <w:t xml:space="preserve">External test</w:t>
+            </w:r>
+          </w:p>
+        </w:tc>
+        <w:tc>
+          <w:tcPr>
+            <w:tcW w:type="dxa" w:w="1872"/>
+            <w:shd w:fill="EDF3F4" w:val="clear"/>
+            <w:tcMar>
+              <w:top w:type="dxa" w:w="60"/>
+              <w:left w:type="dxa" w:w="100"/>
+              <w:bottom w:type="dxa" w:w="60"/>
+              <w:right w:type="dxa" w:w="100"/>
+            </w:tcMar>
+          </w:tcPr>
+          <w:p>
+            <w:pPr>
+              <w:spacing w:after="20" w:before="20"/>
+            </w:pPr>
+            <w:r>
+              <w:rPr>
+                <w:rFonts w:ascii="Calibri" w:cs="Calibri" w:eastAsia="Calibri" w:hAnsi="Calibri"/>
+                <w:b/>
+                <w:bCs/>
+                <w:sz w:val="19"/>
+                <w:szCs w:val="19"/>
+              </w:rPr>
+              <w:t xml:space="preserve">Evaluation used</w:t>
+            </w:r>
+          </w:p>
+        </w:tc>
+      </w:tr>
+      <w:tr>
+        <w:trPr>
+          <w:tblHeader w:val="false"/>
+        </w:trPr>
+        <w:tc>
+          <w:tcPr>
+            <w:tcW w:type="dxa" w:w="1872"/>
+            <w:tcMar>
+              <w:top w:type="dxa" w:w="60"/>
+              <w:left w:type="dxa" w:w="100"/>
+              <w:bottom w:type="dxa" w:w="60"/>
+              <w:right w:type="dxa" w:w="100"/>
+            </w:tcMar>
+          </w:tcPr>
+          <w:p>
+            <w:pPr>
+              <w:spacing w:after="20" w:before="20"/>
+            </w:pPr>
+            <w:r>
+              <w:rPr>
+                <w:rFonts w:ascii="Cambria" w:cs="Cambria" w:eastAsia="Cambria" w:hAnsi="Cambria"/>
+                <w:sz w:val="19"/>
+                <w:szCs w:val="19"/>
+              </w:rPr>
+              <w:t xml:space="preserve">25-condition (Indian-focused)</w:t>
+            </w:r>
+          </w:p>
+        </w:tc>
+        <w:tc>
+          <w:tcPr>
+            <w:tcW w:type="dxa" w:w="1872"/>
+            <w:tcMar>
+              <w:top w:type="dxa" w:w="60"/>
+              <w:left w:type="dxa" w:w="100"/>
+              <w:bottom w:type="dxa" w:w="60"/>
+              <w:right w:type="dxa" w:w="100"/>
+            </w:tcMar>
+          </w:tcPr>
+          <w:p>
+            <w:pPr>
+              <w:spacing w:after="20" w:before="20"/>
+            </w:pPr>
+            <w:r>
+              <w:rPr>
+                <w:rFonts w:ascii="Cambria" w:cs="Cambria" w:eastAsia="Cambria" w:hAnsi="Cambria"/>
+                <w:sz w:val="19"/>
+                <w:szCs w:val="19"/>
+              </w:rPr>
+              <w:t xml:space="preserve">25</w:t>
+            </w:r>
+          </w:p>
+        </w:tc>
+        <w:tc>
+          <w:tcPr>
+            <w:tcW w:type="dxa" w:w="1872"/>
+            <w:tcMar>
+              <w:top w:type="dxa" w:w="60"/>
+              <w:left w:type="dxa" w:w="100"/>
+              <w:bottom w:type="dxa" w:w="60"/>
+              <w:right w:type="dxa" w:w="100"/>
+            </w:tcMar>
+          </w:tcPr>
+          <w:p>
+            <w:pPr>
+              <w:spacing w:after="20" w:before="20"/>
+            </w:pPr>
+            <w:r>
+              <w:rPr>
+                <w:rFonts w:ascii="Cambria" w:cs="Cambria" w:eastAsia="Cambria" w:hAnsi="Cambria"/>
+                <w:sz w:val="19"/>
+                <w:szCs w:val="19"/>
+              </w:rPr>
+              <w:t xml:space="preserve">33,250</w:t>
+            </w:r>
+          </w:p>
+        </w:tc>
+        <w:tc>
+          <w:tcPr>
+            <w:tcW w:type="dxa" w:w="1872"/>
+            <w:tcMar>
+              <w:top w:type="dxa" w:w="60"/>
+              <w:left w:type="dxa" w:w="100"/>
+              <w:bottom w:type="dxa" w:w="60"/>
+              <w:right w:type="dxa" w:w="100"/>
+            </w:tcMar>
+          </w:tcPr>
+          <w:p>
+            <w:pPr>
+              <w:spacing w:after="20" w:before="20"/>
+            </w:pPr>
+            <w:r>
+              <w:rPr>
+                <w:rFonts w:ascii="Cambria" w:cs="Cambria" w:eastAsia="Cambria" w:hAnsi="Cambria"/>
+                <w:sz w:val="19"/>
+                <w:szCs w:val="19"/>
+              </w:rPr>
+              <w:t xml:space="preserve">5,886 → </w:t>
+            </w:r>
+            <w:r>
+              <w:rPr>
+                <w:rFonts w:ascii="Cambria" w:cs="Cambria" w:eastAsia="Cambria" w:hAnsi="Cambria"/>
+                <w:b/>
+                <w:bCs/>
+                <w:sz w:val="19"/>
+                <w:szCs w:val="19"/>
+              </w:rPr>
+              <w:t xml:space="preserve">3,813</w:t>
+            </w:r>
+            <w:r>
+              <w:rPr>
+                <w:rFonts w:ascii="Cambria" w:cs="Cambria" w:eastAsia="Cambria" w:hAnsi="Cambria"/>
+                <w:sz w:val="19"/>
+                <w:szCs w:val="19"/>
+              </w:rPr>
+              <w:t xml:space="preserve"> deduped</w:t>
+            </w:r>
+          </w:p>
+        </w:tc>
+        <w:tc>
+          <w:tcPr>
+            <w:tcW w:type="dxa" w:w="1872"/>
+            <w:tcMar>
+              <w:top w:type="dxa" w:w="60"/>
+              <w:left w:type="dxa" w:w="100"/>
+              <w:bottom w:type="dxa" w:w="60"/>
+              <w:right w:type="dxa" w:w="100"/>
+            </w:tcMar>
+          </w:tcPr>
+          <w:p>
+            <w:pPr>
+              <w:spacing w:after="20" w:before="20"/>
+            </w:pPr>
+            <w:r>
+              <w:rPr>
+                <w:rFonts w:ascii="Cambria" w:cs="Cambria" w:eastAsia="Cambria" w:hAnsi="Cambria"/>
+                <w:sz w:val="19"/>
+                <w:szCs w:val="19"/>
+              </w:rPr>
+              <w:t xml:space="preserve">de-duplicated external</w:t>
+            </w:r>
+          </w:p>
+        </w:tc>
+      </w:tr>
+      <w:tr>
+        <w:trPr>
+          <w:tblHeader w:val="false"/>
+        </w:trPr>
+        <w:tc>
+          <w:tcPr>
+            <w:tcW w:type="dxa" w:w="1872"/>
+            <w:tcMar>
+              <w:top w:type="dxa" w:w="60"/>
+              <w:left w:type="dxa" w:w="100"/>
+              <w:bottom w:type="dxa" w:w="60"/>
+              <w:right w:type="dxa" w:w="100"/>
+            </w:tcMar>
+          </w:tcPr>
+          <w:p>
+            <w:pPr>
+              <w:spacing w:after="20" w:before="20"/>
+            </w:pPr>
+            <w:r>
+              <w:rPr>
+                <w:rFonts w:ascii="Cambria" w:cs="Cambria" w:eastAsia="Cambria" w:hAnsi="Cambria"/>
+                <w:sz w:val="19"/>
+                <w:szCs w:val="19"/>
+              </w:rPr>
+              <w:t xml:space="preserve">9-condition (dermoscopy)</w:t>
+            </w:r>
+          </w:p>
+        </w:tc>
+        <w:tc>
+          <w:tcPr>
+            <w:tcW w:type="dxa" w:w="1872"/>
+            <w:tcMar>
+              <w:top w:type="dxa" w:w="60"/>
+              <w:left w:type="dxa" w:w="100"/>
+              <w:bottom w:type="dxa" w:w="60"/>
+              <w:right w:type="dxa" w:w="100"/>
+            </w:tcMar>
+          </w:tcPr>
+          <w:p>
+            <w:pPr>
+              <w:spacing w:after="20" w:before="20"/>
+            </w:pPr>
+            <w:r>
+              <w:rPr>
+                <w:rFonts w:ascii="Cambria" w:cs="Cambria" w:eastAsia="Cambria" w:hAnsi="Cambria"/>
+                <w:sz w:val="19"/>
+                <w:szCs w:val="19"/>
+              </w:rPr>
+              <w:t xml:space="preserve">9</w:t>
+            </w:r>
+          </w:p>
+        </w:tc>
+        <w:tc>
+          <w:tcPr>
+            <w:tcW w:type="dxa" w:w="1872"/>
+            <w:tcMar>
+              <w:top w:type="dxa" w:w="60"/>
+              <w:left w:type="dxa" w:w="100"/>
+              <w:bottom w:type="dxa" w:w="60"/>
+              <w:right w:type="dxa" w:w="100"/>
+            </w:tcMar>
+          </w:tcPr>
+          <w:p>
+            <w:pPr>
+              <w:spacing w:after="20" w:before="20"/>
+            </w:pPr>
+            <w:r>
+              <w:rPr>
+                <w:rFonts w:ascii="Cambria" w:cs="Cambria" w:eastAsia="Cambria" w:hAnsi="Cambria"/>
+                <w:sz w:val="19"/>
+                <w:szCs w:val="19"/>
+              </w:rPr>
+              <w:t xml:space="preserve">197,137</w:t>
+            </w:r>
+          </w:p>
+        </w:tc>
+        <w:tc>
+          <w:tcPr>
+            <w:tcW w:type="dxa" w:w="1872"/>
+            <w:tcMar>
+              <w:top w:type="dxa" w:w="60"/>
+              <w:left w:type="dxa" w:w="100"/>
+              <w:bottom w:type="dxa" w:w="60"/>
+              <w:right w:type="dxa" w:w="100"/>
+            </w:tcMar>
+          </w:tcPr>
+          <w:p>
+            <w:pPr>
+              <w:spacing w:after="20" w:before="20"/>
+            </w:pPr>
+            <w:r>
+              <w:rPr>
+                <w:rFonts w:ascii="Cambria" w:cs="Cambria" w:eastAsia="Cambria" w:hAnsi="Cambria"/>
+                <w:sz w:val="19"/>
+                <w:szCs w:val="19"/>
+              </w:rPr>
+              <w:t xml:space="preserve">51,035 (99.8% nevi)</w:t>
+            </w:r>
+          </w:p>
+        </w:tc>
+        <w:tc>
+          <w:tcPr>
+            <w:tcW w:type="dxa" w:w="1872"/>
+            <w:tcMar>
+              <w:top w:type="dxa" w:w="60"/>
+              <w:left w:type="dxa" w:w="100"/>
+              <w:bottom w:type="dxa" w:w="60"/>
+              <w:right w:type="dxa" w:w="100"/>
+            </w:tcMar>
+          </w:tcPr>
+          <w:p>
+            <w:pPr>
+              <w:spacing w:after="20" w:before="20"/>
+            </w:pPr>
+            <w:r>
+              <w:rPr>
+                <w:rFonts w:ascii="Cambria" w:cs="Cambria" w:eastAsia="Cambria" w:hAnsi="Cambria"/>
+                <w:sz w:val="19"/>
+                <w:szCs w:val="19"/>
+              </w:rPr>
+              <w:t xml:space="preserve">out-of-fold CV</w:t>
+            </w:r>
+          </w:p>
+        </w:tc>
+      </w:tr>
+      <w:tr>
+        <w:trPr>
+          <w:tblHeader w:val="false"/>
+        </w:trPr>
+        <w:tc>
+          <w:tcPr>
+            <w:tcW w:type="dxa" w:w="1872"/>
+            <w:tcMar>
+              <w:top w:type="dxa" w:w="60"/>
+              <w:left w:type="dxa" w:w="100"/>
+              <w:bottom w:type="dxa" w:w="60"/>
+              <w:right w:type="dxa" w:w="100"/>
+            </w:tcMar>
+          </w:tcPr>
+          <w:p>
+            <w:pPr>
+              <w:spacing w:after="20" w:before="20"/>
+            </w:pPr>
+            <w:r>
+              <w:rPr>
+                <w:rFonts w:ascii="Cambria" w:cs="Cambria" w:eastAsia="Cambria" w:hAnsi="Cambria"/>
+                <w:sz w:val="19"/>
+                <w:szCs w:val="19"/>
+              </w:rPr>
+              <w:t xml:space="preserve">DDI (dark-skin cancer)</w:t>
+            </w:r>
+          </w:p>
+        </w:tc>
+        <w:tc>
+          <w:tcPr>
+            <w:tcW w:type="dxa" w:w="1872"/>
+            <w:tcMar>
+              <w:top w:type="dxa" w:w="60"/>
+              <w:left w:type="dxa" w:w="100"/>
+              <w:bottom w:type="dxa" w:w="60"/>
+              <w:right w:type="dxa" w:w="100"/>
+            </w:tcMar>
+          </w:tcPr>
+          <w:p>
+            <w:pPr>
+              <w:spacing w:after="20" w:before="20"/>
+            </w:pPr>
+            <w:r>
+              <w:rPr>
+                <w:rFonts w:ascii="Cambria" w:cs="Cambria" w:eastAsia="Cambria" w:hAnsi="Cambria"/>
+                <w:sz w:val="19"/>
+                <w:szCs w:val="19"/>
+              </w:rPr>
+              <w:t xml:space="preserve">2</w:t>
+            </w:r>
+          </w:p>
+        </w:tc>
+        <w:tc>
+          <w:tcPr>
+            <w:tcW w:type="dxa" w:w="1872"/>
+            <w:tcMar>
+              <w:top w:type="dxa" w:w="60"/>
+              <w:left w:type="dxa" w:w="100"/>
+              <w:bottom w:type="dxa" w:w="60"/>
+              <w:right w:type="dxa" w:w="100"/>
+            </w:tcMar>
+          </w:tcPr>
+          <w:p>
+            <w:pPr>
+              <w:spacing w:after="20" w:before="20"/>
+            </w:pPr>
+            <w:r>
+              <w:rPr>
+                <w:rFonts w:ascii="Cambria" w:cs="Cambria" w:eastAsia="Cambria" w:hAnsi="Cambria"/>
+                <w:sz w:val="19"/>
+                <w:szCs w:val="19"/>
+              </w:rPr>
+              <w:t xml:space="preserve">—</w:t>
+            </w:r>
+          </w:p>
+        </w:tc>
+        <w:tc>
+          <w:tcPr>
+            <w:tcW w:type="dxa" w:w="1872"/>
+            <w:tcMar>
+              <w:top w:type="dxa" w:w="60"/>
+              <w:left w:type="dxa" w:w="100"/>
+              <w:bottom w:type="dxa" w:w="60"/>
+              <w:right w:type="dxa" w:w="100"/>
+            </w:tcMar>
+          </w:tcPr>
+          <w:p>
+            <w:pPr>
+              <w:spacing w:after="20" w:before="20"/>
+            </w:pPr>
+            <w:r>
+              <w:rPr>
+                <w:rFonts w:ascii="Cambria" w:cs="Cambria" w:eastAsia="Cambria" w:hAnsi="Cambria"/>
+                <w:sz w:val="19"/>
+                <w:szCs w:val="19"/>
+              </w:rPr>
+              <w:t xml:space="preserve">656 (all)</w:t>
+            </w:r>
+          </w:p>
+        </w:tc>
+        <w:tc>
+          <w:tcPr>
+            <w:tcW w:type="dxa" w:w="1872"/>
+            <w:tcMar>
+              <w:top w:type="dxa" w:w="60"/>
+              <w:left w:type="dxa" w:w="100"/>
+              <w:bottom w:type="dxa" w:w="60"/>
+              <w:right w:type="dxa" w:w="100"/>
+            </w:tcMar>
+          </w:tcPr>
+          <w:p>
+            <w:pPr>
+              <w:spacing w:after="20" w:before="20"/>
+            </w:pPr>
+            <w:r>
+              <w:rPr>
+                <w:rFonts w:ascii="Cambria" w:cs="Cambria" w:eastAsia="Cambria" w:hAnsi="Cambria"/>
+                <w:sz w:val="19"/>
+                <w:szCs w:val="19"/>
+              </w:rPr>
+              <w:t xml:space="preserve">image-level 5-fold CV</w:t>
+            </w:r>
+          </w:p>
+        </w:tc>
+      </w:tr>
+    </w:tbl>
+    <w:p>
+      <w:pPr>
+        <w:spacing w:after="200"/>
+      </w:pPr>
     </w:p>
     <w:p>
       <w:pPr>

</xml_diff>